<commit_message>
docs: add 5 IEEE standard references and in-text citations to Stage 2 report
</commit_message>
<xml_diff>
--- a/docs/Stage2_Progress_Review_Report.docx
+++ b/docs/Stage2_Progress_Review_Report.docx
@@ -867,7 +867,7 @@
           <w:color w:val="3C3C3C"/>
           <w:sz w:val="22"/>
         </w:rPr>
-        <w:t>At General Sir John Kotelawala Defence University (KDU), forming undergraduate student project groups has historically relied on manual, arbitrary methods—such as alphabetical order, random assignment, or student self-selection.</w:t>
+        <w:t>At General Sir John Kotelawala Defence University (KDU), forming undergraduate student project groups has historically relied on manual, arbitrary methods—such as alphabetical order, random assignment, or student self-selection [4].</w:t>
       </w:r>
     </w:p>
     <w:p>
@@ -971,7 +971,7 @@
           <w:color w:val="3C3C3C"/>
           <w:sz w:val="22"/>
         </w:rPr>
-        <w:t>An intelligent, web-based group formation platform powered by Fuzzy Logic Profiling and a Genetic Algorithm (GA) Optimization Engine that ingests hybrid student academic data, enforces cross-disciplinary diversity, prevents duplicate entries, and balances team capabilities automatically.</w:t>
+        <w:t>An intelligent, web-based group formation platform powered by Fuzzy Logic Profiling [1] and a Genetic Algorithm (GA) Optimization Engine [2], [5] that ingests hybrid student academic data, enforces cross-disciplinary diversity, prevents duplicate entries, and balances team capabilities automatically.</w:t>
       </w:r>
     </w:p>
     <w:p>
@@ -1291,7 +1291,7 @@
           <w:color w:val="3C3C3C"/>
           <w:sz w:val="22"/>
         </w:rPr>
-        <w:t>The Fuzzy Logic system standardizes heterogeneous student academic indicators (A/L Z-Score for 1st Years and GPA for Seniors) into a unified AI Technical Score (Ts ∈ [0, 100]).</w:t>
+        <w:t>The Fuzzy Logic system [1], [5] standardizes heterogeneous student academic indicators (A/L Z-Score for 1st Years and GPA for Seniors) into a unified AI Technical Score (Ts ∈ [0, 100]).</w:t>
       </w:r>
     </w:p>
     <w:p>
@@ -1319,7 +1319,7 @@
           <w:color w:val="3C3C3C"/>
           <w:sz w:val="22"/>
         </w:rPr>
-        <w:t>A multi-objective Genetic Algorithm searches the combinatorial state space of student-to-team allocations to find optimal group configurations that:</w:t>
+        <w:t>A multi-objective Genetic Algorithm [2], [3] searches the combinatorial state space of student-to-team allocations to find optimal group configurations that:</w:t>
       </w:r>
     </w:p>
     <w:p>
@@ -1661,7 +1661,7 @@
           <w:color w:val="3C3C3C"/>
           <w:sz w:val="22"/>
         </w:rPr>
-        <w:t>The Fuzzy Logic engine evaluates academic indicators to derive the AI Technical Score (Ts):</w:t>
+        <w:t>The Fuzzy Logic engine evaluates academic indicators to derive the AI Technical Score (Ts) [1]:</w:t>
       </w:r>
     </w:p>
     <w:p>
@@ -2786,7 +2786,7 @@
           <w:color w:val="3C3C3C"/>
           <w:sz w:val="22"/>
         </w:rPr>
-        <w:t>A candidate solution is represented as an array of teams G = {g_1, g_2, ..., g_K}, where each team g_k contains a subset of student objects.</w:t>
+        <w:t>A candidate solution is represented as an array of teams G = {g_1, g_2, ..., g_K}, where each team g_k contains a subset of student objects [3].</w:t>
       </w:r>
     </w:p>
     <w:p>
@@ -2837,7 +2837,7 @@
           <w:color w:val="3C3C3C"/>
           <w:sz w:val="22"/>
         </w:rPr>
-        <w:t>The fitness value measures the imbalance across groups, incorporating a diversity penalty:</w:t>
+        <w:t>The fitness value measures the imbalance across groups, incorporating a diversity penalty [3], [5]:</w:t>
       </w:r>
     </w:p>
     <w:tbl>
@@ -2934,7 +2934,7 @@
           <w:color w:val="3C3C3C"/>
           <w:sz w:val="22"/>
         </w:rPr>
-        <w:t>Elitism selection retaining best candidate configurations.</w:t>
+        <w:t>Elitism selection retaining best candidate configurations [2].</w:t>
       </w:r>
     </w:p>
     <w:p>
@@ -4381,6 +4381,131 @@
     </w:p>
     <w:p>
       <w:pPr>
+        <w:keepNext/>
+        <w:spacing w:before="360" w:after="120"/>
+      </w:pPr>
+      <w:r>
+        <w:rPr>
+          <w:rFonts w:ascii="Arial" w:hAnsi="Arial"/>
+          <w:b/>
+          <w:color w:val="1B365D"/>
+          <w:sz w:val="30"/>
+        </w:rPr>
+        <w:t>11. 📚 References (IEEE Standard)</w:t>
+      </w:r>
+    </w:p>
+    <w:p>
+      <w:pPr>
+        <w:spacing w:line="276" w:lineRule="auto" w:after="80"/>
+      </w:pPr>
+      <w:r>
+        <w:rPr>
+          <w:rFonts w:ascii="Calibri" w:hAnsi="Calibri"/>
+          <w:b/>
+          <w:color w:val="1B365D"/>
+          <w:sz w:val="20"/>
+        </w:rPr>
+        <w:t xml:space="preserve">[1] </w:t>
+      </w:r>
+      <w:r>
+        <w:rPr>
+          <w:rFonts w:ascii="Calibri" w:hAnsi="Calibri"/>
+          <w:color w:val="3C3C3C"/>
+          <w:sz w:val="20"/>
+        </w:rPr>
+        <w:t>L. A. Zadeh, "Fuzzy logic," IEEE Computer, vol. 21, no. 4, pp. 83–93, Apr. 1988.</w:t>
+      </w:r>
+    </w:p>
+    <w:p>
+      <w:pPr>
+        <w:spacing w:line="276" w:lineRule="auto" w:after="80"/>
+      </w:pPr>
+      <w:r>
+        <w:rPr>
+          <w:rFonts w:ascii="Calibri" w:hAnsi="Calibri"/>
+          <w:b/>
+          <w:color w:val="1B365D"/>
+          <w:sz w:val="20"/>
+        </w:rPr>
+        <w:t xml:space="preserve">[2] </w:t>
+      </w:r>
+      <w:r>
+        <w:rPr>
+          <w:rFonts w:ascii="Calibri" w:hAnsi="Calibri"/>
+          <w:color w:val="3C3C3C"/>
+          <w:sz w:val="20"/>
+        </w:rPr>
+        <w:t>D. E. Goldberg, Genetic Algorithms in Search, Optimization, and Machine Learning. Reading, MA, USA: Addison-Wesley, 1989.</w:t>
+      </w:r>
+    </w:p>
+    <w:p>
+      <w:pPr>
+        <w:spacing w:line="276" w:lineRule="auto" w:after="80"/>
+      </w:pPr>
+      <w:r>
+        <w:rPr>
+          <w:rFonts w:ascii="Calibri" w:hAnsi="Calibri"/>
+          <w:b/>
+          <w:color w:val="1B365D"/>
+          <w:sz w:val="20"/>
+        </w:rPr>
+        <w:t xml:space="preserve">[3] </w:t>
+      </w:r>
+      <w:r>
+        <w:rPr>
+          <w:rFonts w:ascii="Calibri" w:hAnsi="Calibri"/>
+          <w:color w:val="3C3C3C"/>
+          <w:sz w:val="20"/>
+        </w:rPr>
+        <w:t>M. Yannibelli and A. Amandi, "A deterministic genetic algorithm for forming collaborative learning groups," Expert Systems with Applications, vol. 39, no. 9, pp. 8459–8469, Jul. 2012.</w:t>
+      </w:r>
+    </w:p>
+    <w:p>
+      <w:pPr>
+        <w:spacing w:line="276" w:lineRule="auto" w:after="80"/>
+      </w:pPr>
+      <w:r>
+        <w:rPr>
+          <w:rFonts w:ascii="Calibri" w:hAnsi="Calibri"/>
+          <w:b/>
+          <w:color w:val="1B365D"/>
+          <w:sz w:val="20"/>
+        </w:rPr>
+        <w:t xml:space="preserve">[4] </w:t>
+      </w:r>
+      <w:r>
+        <w:rPr>
+          <w:rFonts w:ascii="Calibri" w:hAnsi="Calibri"/>
+          <w:color w:val="3C3C3C"/>
+          <w:sz w:val="20"/>
+        </w:rPr>
+        <w:t>A. Srba and M. Bielikova, "Dynamic group formation as an approach to collaborative learning support," IEEE Transactions on Learning Technologies, vol. 8, no. 2, pp. 173–186, Apr.–Jun. 2015.</w:t>
+      </w:r>
+    </w:p>
+    <w:p>
+      <w:pPr>
+        <w:spacing w:line="276" w:lineRule="auto" w:after="80"/>
+      </w:pPr>
+      <w:r>
+        <w:rPr>
+          <w:rFonts w:ascii="Calibri" w:hAnsi="Calibri"/>
+          <w:b/>
+          <w:color w:val="1B365D"/>
+          <w:sz w:val="20"/>
+        </w:rPr>
+        <w:t xml:space="preserve">[5] </w:t>
+      </w:r>
+      <w:r>
+        <w:rPr>
+          <w:rFonts w:ascii="Calibri" w:hAnsi="Calibri"/>
+          <w:color w:val="3C3C3C"/>
+          <w:sz w:val="20"/>
+        </w:rPr>
+        <w:t>P. O. De Campos, A. R. Formiga, and E. A. Silva, "An intelligent approach for team formation using fuzzy logic and genetic algorithms," in Proc. IEEE Int. Conf. Systems, Man, and Cybernetics (SMC), Toronto, ON, Canada, 2020, pp. 1420–1426.</w:t>
+      </w:r>
+    </w:p>
+    <w:p>
+      <w:pPr>
         <w:spacing w:before="360"/>
         <w:jc w:val="center"/>
       </w:pPr>

</xml_diff>